<commit_message>
adapted schema db to mysql
</commit_message>
<xml_diff>
--- a/docs/bbdd/modelo-relacional.docx
+++ b/docs/bbdd/modelo-relacional.docx
@@ -40,10 +40,10 @@
         <w:tblLook w:val="04A0" w:firstRow="1" w:lastRow="0" w:firstColumn="1" w:lastColumn="0" w:noHBand="0" w:noVBand="1"/>
       </w:tblPr>
       <w:tblGrid>
-        <w:gridCol w:w="2018"/>
+        <w:gridCol w:w="2023"/>
         <w:gridCol w:w="2184"/>
-        <w:gridCol w:w="1190"/>
-        <w:gridCol w:w="3392"/>
+        <w:gridCol w:w="1182"/>
+        <w:gridCol w:w="3395"/>
       </w:tblGrid>
       <w:tr>
         <w:tc>
@@ -122,7 +122,7 @@
               <w:jc w:val="center"/>
             </w:pPr>
             <w:r>
-              <w:t>SERIAL</w:t>
+              <w:t>INT</w:t>
             </w:r>
           </w:p>
         </w:tc>
@@ -148,7 +148,7 @@
               <w:jc w:val="center"/>
             </w:pPr>
             <w:r>
-              <w:t>Not null</w:t>
+              <w:t>AUTO_INCREMENT</w:t>
             </w:r>
           </w:p>
         </w:tc>
@@ -562,7 +562,62 @@
           </w:p>
         </w:tc>
       </w:tr>
+      <w:tr>
+        <w:trPr>
+          <w:trHeight w:val="584"/>
+        </w:trPr>
+        <w:tc>
+          <w:tcPr>
+            <w:tcW w:w="2097" w:type="dxa"/>
+          </w:tcPr>
+          <w:p>
+            <w:pPr>
+              <w:jc w:val="center"/>
+            </w:pPr>
+            <w:r>
+              <w:t>email_activate</w:t>
+            </w:r>
+          </w:p>
+        </w:tc>
+        <w:tc>
+          <w:tcPr>
+            <w:tcW w:w="1820" w:type="dxa"/>
+          </w:tcPr>
+          <w:p>
+            <w:pPr>
+              <w:jc w:val="center"/>
+            </w:pPr>
+            <w:r>
+              <w:t>BOOLEAN</w:t>
+            </w:r>
+          </w:p>
+        </w:tc>
+        <w:tc>
+          <w:tcPr>
+            <w:tcW w:w="1254" w:type="dxa"/>
+          </w:tcPr>
+          <w:p/>
+        </w:tc>
+        <w:tc>
+          <w:tcPr>
+            <w:tcW w:w="3613" w:type="dxa"/>
+          </w:tcPr>
+          <w:p>
+            <w:r>
+              <w:t xml:space="preserve">   NOT NULL, Default FALSE, </w:t>
+            </w:r>
+          </w:p>
+        </w:tc>
+      </w:tr>
     </w:tbl>
+    <w:p>
+      <w:pPr>
+        <w:rPr>
+          <w:sz w:val="32"/>
+          <w:szCs w:val="32"/>
+        </w:rPr>
+      </w:pPr>
+    </w:p>
     <w:p>
       <w:pPr>
         <w:rPr>
@@ -713,7 +768,7 @@
               <w:jc w:val="center"/>
             </w:pPr>
             <w:r>
-              <w:t>SERIAL</w:t>
+              <w:t>INT</w:t>
             </w:r>
           </w:p>
         </w:tc>
@@ -739,7 +794,7 @@
               <w:jc w:val="center"/>
             </w:pPr>
             <w:r>
-              <w:t>SERIAL</w:t>
+              <w:t>AUTO_INCREMENT</w:t>
             </w:r>
           </w:p>
         </w:tc>
@@ -1025,11 +1080,19 @@
           <w:p>
             <w:pPr>
               <w:tabs>
+                <w:tab w:val="left" w:pos="1125"/>
                 <w:tab w:val="center" w:pos="1731"/>
+                <w:tab w:val="center" w:pos="1947"/>
                 <w:tab w:val="left" w:pos="2460"/>
               </w:tabs>
-              <w:jc w:val="center"/>
-            </w:pPr>
+            </w:pPr>
+            <w:r>
+              <w:tab/>
+            </w:r>
+            <w:r>
+              <w:tab/>
+              <w:t>not null,</w:t>
+            </w:r>
             <w:r>
               <w:t>Default FALSE</w:t>
             </w:r>
@@ -1037,6 +1100,15 @@
         </w:tc>
       </w:tr>
     </w:tbl>
+    <w:p>
+      <w:pPr>
+        <w:jc w:val="center"/>
+        <w:rPr>
+          <w:sz w:val="32"/>
+          <w:szCs w:val="32"/>
+        </w:rPr>
+      </w:pPr>
+    </w:p>
     <w:p>
       <w:pPr>
         <w:jc w:val="center"/>
@@ -1409,6 +1481,24 @@
           <w:szCs w:val="32"/>
         </w:rPr>
       </w:pPr>
+    </w:p>
+    <w:p>
+      <w:pPr>
+        <w:jc w:val="center"/>
+        <w:rPr>
+          <w:sz w:val="32"/>
+          <w:szCs w:val="32"/>
+        </w:rPr>
+      </w:pPr>
+    </w:p>
+    <w:p>
+      <w:pPr>
+        <w:jc w:val="center"/>
+        <w:rPr>
+          <w:sz w:val="32"/>
+          <w:szCs w:val="32"/>
+        </w:rPr>
+      </w:pPr>
       <w:r>
         <w:rPr>
           <w:sz w:val="32"/>
@@ -1536,7 +1626,7 @@
               <w:jc w:val="center"/>
             </w:pPr>
             <w:r>
-              <w:t>SERIAL</w:t>
+              <w:t>INT</w:t>
             </w:r>
           </w:p>
         </w:tc>
@@ -1549,7 +1639,7 @@
               <w:jc w:val="center"/>
             </w:pPr>
             <w:r>
-              <w:t>PK,</w:t>
+              <w:t>PK</w:t>
             </w:r>
           </w:p>
         </w:tc>
@@ -1562,7 +1652,7 @@
               <w:jc w:val="center"/>
             </w:pPr>
             <w:r>
-              <w:t>Not null</w:t>
+              <w:t>AUTO_INCREMENT</w:t>
             </w:r>
           </w:p>
         </w:tc>
@@ -1811,10 +1901,7 @@
               <w:jc w:val="center"/>
             </w:pPr>
             <w:r>
-              <w:t>Id_</w:t>
-            </w:r>
-            <w:r>
-              <w:t>product</w:t>
+              <w:t>Id_product</w:t>
             </w:r>
           </w:p>
         </w:tc>
@@ -1827,7 +1914,7 @@
               <w:jc w:val="center"/>
             </w:pPr>
             <w:r>
-              <w:t>SERIAL</w:t>
+              <w:t>INT</w:t>
             </w:r>
           </w:p>
         </w:tc>
@@ -1853,7 +1940,7 @@
               <w:jc w:val="center"/>
             </w:pPr>
             <w:r>
-              <w:t>Not null</w:t>
+              <w:t>AUTO_INCREMENT</w:t>
             </w:r>
           </w:p>
         </w:tc>
@@ -2859,6 +2946,40 @@
     </w:p>
     <w:p>
       <w:pPr>
+        <w:ind w:left="3540"/>
+      </w:pPr>
+      <w:r>
+        <w:rPr>
+          <w:sz w:val="32"/>
+          <w:szCs w:val="32"/>
+        </w:rPr>
+        <w:lastRenderedPageBreak/>
+        <w:t>Tabl</w:t>
+      </w:r>
+      <w:r>
+        <w:rPr>
+          <w:sz w:val="32"/>
+          <w:szCs w:val="32"/>
+        </w:rPr>
+        <w:t>e</w:t>
+      </w:r>
+      <w:r>
+        <w:rPr>
+          <w:sz w:val="32"/>
+          <w:szCs w:val="32"/>
+        </w:rPr>
+        <w:t xml:space="preserve"> </w:t>
+      </w:r>
+      <w:r>
+        <w:rPr>
+          <w:sz w:val="32"/>
+          <w:szCs w:val="32"/>
+        </w:rPr>
+        <w:t>sales</w:t>
+      </w:r>
+    </w:p>
+    <w:p>
+      <w:pPr>
         <w:jc w:val="center"/>
         <w:rPr>
           <w:sz w:val="32"/>
@@ -3178,40 +3299,6 @@
         </w:tc>
       </w:tr>
     </w:tbl>
-    <w:p>
-      <w:pPr>
-        <w:ind w:left="3540"/>
-      </w:pPr>
-      <w:r>
-        <w:rPr>
-          <w:sz w:val="32"/>
-          <w:szCs w:val="32"/>
-        </w:rPr>
-        <w:lastRenderedPageBreak/>
-        <w:t>Tabl</w:t>
-      </w:r>
-      <w:r>
-        <w:rPr>
-          <w:sz w:val="32"/>
-          <w:szCs w:val="32"/>
-        </w:rPr>
-        <w:t>e</w:t>
-      </w:r>
-      <w:r>
-        <w:rPr>
-          <w:sz w:val="32"/>
-          <w:szCs w:val="32"/>
-        </w:rPr>
-        <w:t xml:space="preserve"> </w:t>
-      </w:r>
-      <w:r>
-        <w:rPr>
-          <w:sz w:val="32"/>
-          <w:szCs w:val="32"/>
-        </w:rPr>
-        <w:t>sales</w:t>
-      </w:r>
-    </w:p>
     <w:p/>
     <w:p>
       <w:pPr>
@@ -3312,7 +3399,7 @@
               <w:jc w:val="center"/>
             </w:pPr>
             <w:r>
-              <w:t>SERIAL</w:t>
+              <w:t>INT</w:t>
             </w:r>
           </w:p>
         </w:tc>
@@ -3338,7 +3425,7 @@
               <w:jc w:val="center"/>
             </w:pPr>
             <w:r>
-              <w:t>Not null</w:t>
+              <w:t>AUTO_INCREMENT</w:t>
             </w:r>
           </w:p>
         </w:tc>
@@ -3856,60 +3943,6 @@
               <w:jc w:val="center"/>
             </w:pPr>
             <w:r>
-              <w:t>Id_cart_item</w:t>
-            </w:r>
-          </w:p>
-        </w:tc>
-        <w:tc>
-          <w:tcPr>
-            <w:tcW w:w="1843" w:type="dxa"/>
-          </w:tcPr>
-          <w:p>
-            <w:pPr>
-              <w:jc w:val="center"/>
-            </w:pPr>
-            <w:r>
-              <w:t>SERIAL</w:t>
-            </w:r>
-          </w:p>
-        </w:tc>
-        <w:tc>
-          <w:tcPr>
-            <w:tcW w:w="1134" w:type="dxa"/>
-          </w:tcPr>
-          <w:p>
-            <w:pPr>
-              <w:jc w:val="center"/>
-            </w:pPr>
-            <w:r>
-              <w:t>PK</w:t>
-            </w:r>
-          </w:p>
-        </w:tc>
-        <w:tc>
-          <w:tcPr>
-            <w:tcW w:w="4111" w:type="dxa"/>
-          </w:tcPr>
-          <w:p>
-            <w:pPr>
-              <w:jc w:val="center"/>
-            </w:pPr>
-            <w:r>
-              <w:t>Not null</w:t>
-            </w:r>
-          </w:p>
-        </w:tc>
-      </w:tr>
-      <w:tr>
-        <w:tc>
-          <w:tcPr>
-            <w:tcW w:w="1838" w:type="dxa"/>
-          </w:tcPr>
-          <w:p>
-            <w:pPr>
-              <w:jc w:val="center"/>
-            </w:pPr>
-            <w:r>
               <w:t>Id_user</w:t>
             </w:r>
           </w:p>
@@ -3939,6 +3972,9 @@
                 <w:szCs w:val="32"/>
               </w:rPr>
             </w:pPr>
+            <w:r>
+              <w:t>PK,</w:t>
+            </w:r>
             <w:r>
               <w:t>FK</w:t>
             </w:r>
@@ -4002,6 +4038,9 @@
             <w:pPr>
               <w:jc w:val="center"/>
             </w:pPr>
+            <w:r>
+              <w:t>PK,</w:t>
+            </w:r>
             <w:r>
               <w:t>FK</w:t>
             </w:r>
@@ -4516,6 +4555,7 @@
   <w:style w:type="character" w:default="1" w:styleId="Fuentedeprrafopredeter">
     <w:name w:val="Default Paragraph Font"/>
     <w:uiPriority w:val="1"/>
+    <w:semiHidden/>
     <w:unhideWhenUsed/>
   </w:style>
   <w:style w:type="table" w:default="1" w:styleId="Tablanormal">

</xml_diff>

<commit_message>
fix db diagram: add quantity in products_exhibitions table
</commit_message>
<xml_diff>
--- a/docs/bbdd/modelo-relacional.docx
+++ b/docs/bbdd/modelo-relacional.docx
@@ -2615,6 +2615,60 @@
           </w:p>
         </w:tc>
       </w:tr>
+      <w:tr>
+        <w:tc>
+          <w:tcPr>
+            <w:tcW w:w="1838" w:type="dxa"/>
+          </w:tcPr>
+          <w:p>
+            <w:pPr>
+              <w:jc w:val="center"/>
+            </w:pPr>
+            <w:r>
+              <w:t>quantity</w:t>
+            </w:r>
+          </w:p>
+        </w:tc>
+        <w:tc>
+          <w:tcPr>
+            <w:tcW w:w="1985" w:type="dxa"/>
+          </w:tcPr>
+          <w:p>
+            <w:pPr>
+              <w:jc w:val="center"/>
+            </w:pPr>
+            <w:r>
+              <w:t>INT</w:t>
+            </w:r>
+          </w:p>
+        </w:tc>
+        <w:tc>
+          <w:tcPr>
+            <w:tcW w:w="992" w:type="dxa"/>
+          </w:tcPr>
+          <w:p>
+            <w:pPr>
+              <w:jc w:val="center"/>
+            </w:pPr>
+          </w:p>
+        </w:tc>
+        <w:tc>
+          <w:tcPr>
+            <w:tcW w:w="4111" w:type="dxa"/>
+          </w:tcPr>
+          <w:p>
+            <w:pPr>
+              <w:tabs>
+                <w:tab w:val="left" w:pos="1200"/>
+              </w:tabs>
+              <w:jc w:val="center"/>
+            </w:pPr>
+            <w:r>
+              <w:t>Not null, default 0, check (quantity &gt;= 0)</w:t>
+            </w:r>
+          </w:p>
+        </w:tc>
+      </w:tr>
     </w:tbl>
     <w:p/>
     <w:p>
@@ -2632,6 +2686,7 @@
         <w:rPr>
           <w:sz w:val="32"/>
           <w:szCs w:val="32"/>
+          <w:u w:val="single"/>
         </w:rPr>
       </w:pPr>
       <w:r>
@@ -2953,7 +3008,6 @@
           <w:sz w:val="32"/>
           <w:szCs w:val="32"/>
         </w:rPr>
-        <w:lastRenderedPageBreak/>
         <w:t>Tabl</w:t>
       </w:r>
       <w:r>

</xml_diff>

<commit_message>
add constraint to check that admin and moderator can't increase credit anyway
</commit_message>
<xml_diff>
--- a/docs/bbdd/modelo-relacional.docx
+++ b/docs/bbdd/modelo-relacional.docx
@@ -557,7 +557,10 @@
           </w:tcPr>
           <w:p>
             <w:r>
-              <w:t>Not null, default 0.00, check (credit &gt;= 0)</w:t>
+              <w:t xml:space="preserve">Not null, default 0.00, </w:t>
+            </w:r>
+            <w:r>
+              <w:t>CHECK ((rol = 'CLIENT' AND credit &gt;= 0) OR (rol IN ('ADMIN', 'MODERATOR') AND credit = 0.00)</w:t>
             </w:r>
           </w:p>
         </w:tc>

</xml_diff>

<commit_message>
fixed important design database cart user - added exhibition relation to know item-cart-user- relation
</commit_message>
<xml_diff>
--- a/docs/bbdd/modelo-relacional.docx
+++ b/docs/bbdd/modelo-relacional.docx
@@ -4070,6 +4070,78 @@
               <w:jc w:val="center"/>
             </w:pPr>
             <w:r>
+              <w:t>Id_exhibition</w:t>
+            </w:r>
+          </w:p>
+        </w:tc>
+        <w:tc>
+          <w:tcPr>
+            <w:tcW w:w="1843" w:type="dxa"/>
+          </w:tcPr>
+          <w:p>
+            <w:pPr>
+              <w:jc w:val="center"/>
+            </w:pPr>
+            <w:r>
+              <w:t>INT</w:t>
+            </w:r>
+          </w:p>
+        </w:tc>
+        <w:tc>
+          <w:tcPr>
+            <w:tcW w:w="1134" w:type="dxa"/>
+          </w:tcPr>
+          <w:p>
+            <w:pPr>
+              <w:jc w:val="center"/>
+            </w:pPr>
+            <w:r>
+              <w:t>PK,FK</w:t>
+            </w:r>
+          </w:p>
+        </w:tc>
+        <w:tc>
+          <w:tcPr>
+            <w:tcW w:w="4111" w:type="dxa"/>
+          </w:tcPr>
+          <w:p>
+            <w:pPr>
+              <w:tabs>
+                <w:tab w:val="left" w:pos="1200"/>
+              </w:tabs>
+              <w:jc w:val="center"/>
+            </w:pPr>
+            <w:r>
+              <w:t xml:space="preserve">Not null, </w:t>
+            </w:r>
+            <w:r>
+              <w:rPr>
+                <w:rStyle w:val="Textoennegrita"/>
+              </w:rPr>
+              <w:t>REFERENCES exhibitions(id_</w:t>
+            </w:r>
+            <w:r>
+              <w:t>exhibition</w:t>
+            </w:r>
+            <w:r>
+              <w:rPr>
+                <w:rStyle w:val="Textoennegrita"/>
+              </w:rPr>
+              <w:t>)</w:t>
+            </w:r>
+          </w:p>
+        </w:tc>
+      </w:tr>
+      <w:tr>
+        <w:tc>
+          <w:tcPr>
+            <w:tcW w:w="1838" w:type="dxa"/>
+          </w:tcPr>
+          <w:p>
+            <w:pPr>
+              <w:jc w:val="center"/>
+            </w:pPr>
+            <w:r>
               <w:t>Id_product</w:t>
             </w:r>
           </w:p>
@@ -4096,10 +4168,7 @@
               <w:jc w:val="center"/>
             </w:pPr>
             <w:r>
-              <w:t>PK,</w:t>
-            </w:r>
-            <w:r>
-              <w:t>FK</w:t>
+              <w:t>PK,FK</w:t>
             </w:r>
           </w:p>
         </w:tc>

</xml_diff>